<commit_message>
HG7 cierre 88a0970: versión candidata regenerada y verificada
Tomo anual (156 pp.), 36 planes (74 pp.), solucionario (41 pp.), plan anual
y matriz curricular regenerados en DOCX y PDF desde el maestro DOCX y Natural
Earth, junto con los cuatro bloques. Verificadores sin fallos (bloques I a IV,
anual y consolidación); cotejo de los 18 hallazgos: 33 controles correctos, 0
fallos. El cotejo corrige tres falsos positivos propios sin aflojar controles.
Se agregan el informe de cierre y el manifiesto SHA-256. Versión candidata
para el control final de Fernando: no es una aprobación comercial.

Co-Authored-By: Claude Opus 5.5 <noreply@anthropic.com>
Claude-Session: https://claude.ai/code/session_01LqBrALZn8HbnzzUtvCFRMa
</commit_message>
<xml_diff>
--- a/historia_geografia_7/05_produccion_anual/anual/matriz/MATRIZ_CURRICULAR_36_ENCUENTROS_A4.docx
+++ b/historia_geografia_7/05_produccion_anual/anual/matriz/MATRIZ_CURRICULAR_36_ENCUENTROS_A4.docx
@@ -39,11 +39,11 @@
         <w:gridCol w:w="1133"/>
         <w:gridCol w:w="2494"/>
         <w:gridCol w:w="850"/>
-        <w:gridCol w:w="1247"/>
+        <w:gridCol w:w="1417"/>
         <w:gridCol w:w="1077"/>
         <w:gridCol w:w="1360"/>
         <w:gridCol w:w="907"/>
-        <w:gridCol w:w="5782"/>
+        <w:gridCol w:w="5612"/>
       </w:tblGrid>
       <w:tr>
         <w:trPr>
@@ -128,7 +128,7 @@
         </w:tc>
         <w:tc>
           <w:tcPr>
-            <w:tcW w:type="dxa" w:w="1247"/>
+            <w:tcW w:type="dxa" w:w="1417"/>
             <w:shd w:val="clear" w:color="auto" w:fill="1F3A5F"/>
           </w:tcPr>
           <w:p>
@@ -204,7 +204,7 @@
         </w:tc>
         <w:tc>
           <w:tcPr>
-            <w:tcW w:type="dxa" w:w="5783"/>
+            <w:tcW w:type="dxa" w:w="5613"/>
             <w:shd w:val="clear" w:color="auto" w:fill="1F3A5F"/>
           </w:tcPr>
           <w:p>
@@ -296,7 +296,7 @@
         </w:tc>
         <w:tc>
           <w:tcPr>
-            <w:tcW w:type="dxa" w:w="1247"/>
+            <w:tcW w:type="dxa" w:w="1417"/>
           </w:tcPr>
           <w:p>
             <w:pPr>
@@ -364,7 +364,7 @@
         </w:tc>
         <w:tc>
           <w:tcPr>
-            <w:tcW w:type="dxa" w:w="5783"/>
+            <w:tcW w:type="dxa" w:w="5613"/>
           </w:tcPr>
           <w:p>
             <w:pPr>
@@ -453,7 +453,7 @@
         </w:tc>
         <w:tc>
           <w:tcPr>
-            <w:tcW w:type="dxa" w:w="1247"/>
+            <w:tcW w:type="dxa" w:w="1417"/>
           </w:tcPr>
           <w:p>
             <w:pPr>
@@ -521,7 +521,7 @@
         </w:tc>
         <w:tc>
           <w:tcPr>
-            <w:tcW w:type="dxa" w:w="5783"/>
+            <w:tcW w:type="dxa" w:w="5613"/>
           </w:tcPr>
           <w:p>
             <w:pPr>
@@ -610,7 +610,7 @@
         </w:tc>
         <w:tc>
           <w:tcPr>
-            <w:tcW w:type="dxa" w:w="1247"/>
+            <w:tcW w:type="dxa" w:w="1417"/>
           </w:tcPr>
           <w:p>
             <w:pPr>
@@ -678,7 +678,7 @@
         </w:tc>
         <w:tc>
           <w:tcPr>
-            <w:tcW w:type="dxa" w:w="5783"/>
+            <w:tcW w:type="dxa" w:w="5613"/>
           </w:tcPr>
           <w:p>
             <w:pPr>
@@ -767,7 +767,7 @@
         </w:tc>
         <w:tc>
           <w:tcPr>
-            <w:tcW w:type="dxa" w:w="1247"/>
+            <w:tcW w:type="dxa" w:w="1417"/>
           </w:tcPr>
           <w:p>
             <w:pPr>
@@ -835,7 +835,7 @@
         </w:tc>
         <w:tc>
           <w:tcPr>
-            <w:tcW w:type="dxa" w:w="5783"/>
+            <w:tcW w:type="dxa" w:w="5613"/>
           </w:tcPr>
           <w:p>
             <w:pPr>
@@ -925,7 +925,7 @@
         </w:tc>
         <w:tc>
           <w:tcPr>
-            <w:tcW w:type="dxa" w:w="1247"/>
+            <w:tcW w:type="dxa" w:w="1417"/>
           </w:tcPr>
           <w:p>
             <w:pPr>
@@ -993,7 +993,7 @@
         </w:tc>
         <w:tc>
           <w:tcPr>
-            <w:tcW w:type="dxa" w:w="5783"/>
+            <w:tcW w:type="dxa" w:w="5613"/>
           </w:tcPr>
           <w:p>
             <w:pPr>
@@ -1083,7 +1083,7 @@
         </w:tc>
         <w:tc>
           <w:tcPr>
-            <w:tcW w:type="dxa" w:w="1247"/>
+            <w:tcW w:type="dxa" w:w="1417"/>
           </w:tcPr>
           <w:p>
             <w:pPr>
@@ -1151,7 +1151,7 @@
         </w:tc>
         <w:tc>
           <w:tcPr>
-            <w:tcW w:type="dxa" w:w="5783"/>
+            <w:tcW w:type="dxa" w:w="5613"/>
           </w:tcPr>
           <w:p>
             <w:pPr>
@@ -1241,7 +1241,7 @@
         </w:tc>
         <w:tc>
           <w:tcPr>
-            <w:tcW w:type="dxa" w:w="1247"/>
+            <w:tcW w:type="dxa" w:w="1417"/>
           </w:tcPr>
           <w:p>
             <w:pPr>
@@ -1309,7 +1309,7 @@
         </w:tc>
         <w:tc>
           <w:tcPr>
-            <w:tcW w:type="dxa" w:w="5783"/>
+            <w:tcW w:type="dxa" w:w="5613"/>
           </w:tcPr>
           <w:p>
             <w:pPr>
@@ -1398,7 +1398,7 @@
         </w:tc>
         <w:tc>
           <w:tcPr>
-            <w:tcW w:type="dxa" w:w="1247"/>
+            <w:tcW w:type="dxa" w:w="1417"/>
           </w:tcPr>
           <w:p>
             <w:pPr>
@@ -1466,7 +1466,7 @@
         </w:tc>
         <w:tc>
           <w:tcPr>
-            <w:tcW w:type="dxa" w:w="5783"/>
+            <w:tcW w:type="dxa" w:w="5613"/>
           </w:tcPr>
           <w:p>
             <w:pPr>
@@ -1556,7 +1556,7 @@
         </w:tc>
         <w:tc>
           <w:tcPr>
-            <w:tcW w:type="dxa" w:w="1247"/>
+            <w:tcW w:type="dxa" w:w="1417"/>
           </w:tcPr>
           <w:p>
             <w:pPr>
@@ -1624,7 +1624,7 @@
         </w:tc>
         <w:tc>
           <w:tcPr>
-            <w:tcW w:type="dxa" w:w="5783"/>
+            <w:tcW w:type="dxa" w:w="5613"/>
           </w:tcPr>
           <w:p>
             <w:pPr>
@@ -1714,7 +1714,7 @@
         </w:tc>
         <w:tc>
           <w:tcPr>
-            <w:tcW w:type="dxa" w:w="1247"/>
+            <w:tcW w:type="dxa" w:w="1417"/>
           </w:tcPr>
           <w:p>
             <w:pPr>
@@ -1782,7 +1782,7 @@
         </w:tc>
         <w:tc>
           <w:tcPr>
-            <w:tcW w:type="dxa" w:w="5783"/>
+            <w:tcW w:type="dxa" w:w="5613"/>
           </w:tcPr>
           <w:p>
             <w:pPr>
@@ -1872,7 +1872,7 @@
         </w:tc>
         <w:tc>
           <w:tcPr>
-            <w:tcW w:type="dxa" w:w="1247"/>
+            <w:tcW w:type="dxa" w:w="1417"/>
           </w:tcPr>
           <w:p>
             <w:pPr>
@@ -1940,7 +1940,7 @@
         </w:tc>
         <w:tc>
           <w:tcPr>
-            <w:tcW w:type="dxa" w:w="5783"/>
+            <w:tcW w:type="dxa" w:w="5613"/>
           </w:tcPr>
           <w:p>
             <w:pPr>
@@ -2029,7 +2029,7 @@
         </w:tc>
         <w:tc>
           <w:tcPr>
-            <w:tcW w:type="dxa" w:w="1247"/>
+            <w:tcW w:type="dxa" w:w="1417"/>
           </w:tcPr>
           <w:p>
             <w:pPr>
@@ -2091,13 +2091,13 @@
                 <w:b w:val="0"/>
                 <w:sz w:val="15"/>
               </w:rPr>
-              <w:t>52-55</w:t>
-            </w:r>
-          </w:p>
-        </w:tc>
-        <w:tc>
-          <w:tcPr>
-            <w:tcW w:type="dxa" w:w="5783"/>
+              <w:t>52-56</w:t>
+            </w:r>
+          </w:p>
+        </w:tc>
+        <w:tc>
+          <w:tcPr>
+            <w:tcW w:type="dxa" w:w="5613"/>
           </w:tcPr>
           <w:p>
             <w:pPr>
@@ -2186,7 +2186,7 @@
         </w:tc>
         <w:tc>
           <w:tcPr>
-            <w:tcW w:type="dxa" w:w="1247"/>
+            <w:tcW w:type="dxa" w:w="1417"/>
           </w:tcPr>
           <w:p>
             <w:pPr>
@@ -2248,13 +2248,13 @@
                 <w:b w:val="0"/>
                 <w:sz w:val="15"/>
               </w:rPr>
-              <w:t>56-58</w:t>
-            </w:r>
-          </w:p>
-        </w:tc>
-        <w:tc>
-          <w:tcPr>
-            <w:tcW w:type="dxa" w:w="5783"/>
+              <w:t>57-59</w:t>
+            </w:r>
+          </w:p>
+        </w:tc>
+        <w:tc>
+          <w:tcPr>
+            <w:tcW w:type="dxa" w:w="5613"/>
           </w:tcPr>
           <w:p>
             <w:pPr>
@@ -2344,7 +2344,7 @@
         </w:tc>
         <w:tc>
           <w:tcPr>
-            <w:tcW w:type="dxa" w:w="1247"/>
+            <w:tcW w:type="dxa" w:w="1417"/>
           </w:tcPr>
           <w:p>
             <w:pPr>
@@ -2406,13 +2406,13 @@
                 <w:b w:val="0"/>
                 <w:sz w:val="15"/>
               </w:rPr>
-              <w:t>60-63</w:t>
-            </w:r>
-          </w:p>
-        </w:tc>
-        <w:tc>
-          <w:tcPr>
-            <w:tcW w:type="dxa" w:w="5783"/>
+              <w:t>61-64</w:t>
+            </w:r>
+          </w:p>
+        </w:tc>
+        <w:tc>
+          <w:tcPr>
+            <w:tcW w:type="dxa" w:w="5613"/>
           </w:tcPr>
           <w:p>
             <w:pPr>
@@ -2501,7 +2501,7 @@
         </w:tc>
         <w:tc>
           <w:tcPr>
-            <w:tcW w:type="dxa" w:w="1247"/>
+            <w:tcW w:type="dxa" w:w="1417"/>
           </w:tcPr>
           <w:p>
             <w:pPr>
@@ -2563,13 +2563,13 @@
                 <w:b w:val="0"/>
                 <w:sz w:val="15"/>
               </w:rPr>
-              <w:t>64-69</w:t>
-            </w:r>
-          </w:p>
-        </w:tc>
-        <w:tc>
-          <w:tcPr>
-            <w:tcW w:type="dxa" w:w="5783"/>
+              <w:t>65-70</w:t>
+            </w:r>
+          </w:p>
+        </w:tc>
+        <w:tc>
+          <w:tcPr>
+            <w:tcW w:type="dxa" w:w="5613"/>
           </w:tcPr>
           <w:p>
             <w:pPr>
@@ -2658,7 +2658,7 @@
         </w:tc>
         <w:tc>
           <w:tcPr>
-            <w:tcW w:type="dxa" w:w="1247"/>
+            <w:tcW w:type="dxa" w:w="1417"/>
           </w:tcPr>
           <w:p>
             <w:pPr>
@@ -2720,13 +2720,13 @@
                 <w:b w:val="0"/>
                 <w:sz w:val="15"/>
               </w:rPr>
-              <w:t>70-72</w:t>
-            </w:r>
-          </w:p>
-        </w:tc>
-        <w:tc>
-          <w:tcPr>
-            <w:tcW w:type="dxa" w:w="5783"/>
+              <w:t>71-73</w:t>
+            </w:r>
+          </w:p>
+        </w:tc>
+        <w:tc>
+          <w:tcPr>
+            <w:tcW w:type="dxa" w:w="5613"/>
           </w:tcPr>
           <w:p>
             <w:pPr>
@@ -2816,7 +2816,7 @@
         </w:tc>
         <w:tc>
           <w:tcPr>
-            <w:tcW w:type="dxa" w:w="1247"/>
+            <w:tcW w:type="dxa" w:w="1417"/>
           </w:tcPr>
           <w:p>
             <w:pPr>
@@ -2878,13 +2878,13 @@
                 <w:b w:val="0"/>
                 <w:sz w:val="15"/>
               </w:rPr>
-              <w:t>73-75</w:t>
-            </w:r>
-          </w:p>
-        </w:tc>
-        <w:tc>
-          <w:tcPr>
-            <w:tcW w:type="dxa" w:w="5783"/>
+              <w:t>74-76</w:t>
+            </w:r>
+          </w:p>
+        </w:tc>
+        <w:tc>
+          <w:tcPr>
+            <w:tcW w:type="dxa" w:w="5613"/>
           </w:tcPr>
           <w:p>
             <w:pPr>
@@ -2974,7 +2974,7 @@
         </w:tc>
         <w:tc>
           <w:tcPr>
-            <w:tcW w:type="dxa" w:w="1247"/>
+            <w:tcW w:type="dxa" w:w="1417"/>
           </w:tcPr>
           <w:p>
             <w:pPr>
@@ -3036,13 +3036,13 @@
                 <w:b w:val="0"/>
                 <w:sz w:val="15"/>
               </w:rPr>
-              <w:t>76-78</w:t>
-            </w:r>
-          </w:p>
-        </w:tc>
-        <w:tc>
-          <w:tcPr>
-            <w:tcW w:type="dxa" w:w="5783"/>
+              <w:t>77-79</w:t>
+            </w:r>
+          </w:p>
+        </w:tc>
+        <w:tc>
+          <w:tcPr>
+            <w:tcW w:type="dxa" w:w="5613"/>
           </w:tcPr>
           <w:p>
             <w:pPr>
@@ -3132,7 +3132,7 @@
         </w:tc>
         <w:tc>
           <w:tcPr>
-            <w:tcW w:type="dxa" w:w="1247"/>
+            <w:tcW w:type="dxa" w:w="1417"/>
           </w:tcPr>
           <w:p>
             <w:pPr>
@@ -3194,13 +3194,13 @@
                 <w:b w:val="0"/>
                 <w:sz w:val="15"/>
               </w:rPr>
-              <w:t>79-82</w:t>
-            </w:r>
-          </w:p>
-        </w:tc>
-        <w:tc>
-          <w:tcPr>
-            <w:tcW w:type="dxa" w:w="5783"/>
+              <w:t>80-83</w:t>
+            </w:r>
+          </w:p>
+        </w:tc>
+        <w:tc>
+          <w:tcPr>
+            <w:tcW w:type="dxa" w:w="5613"/>
           </w:tcPr>
           <w:p>
             <w:pPr>
@@ -3290,7 +3290,7 @@
         </w:tc>
         <w:tc>
           <w:tcPr>
-            <w:tcW w:type="dxa" w:w="1247"/>
+            <w:tcW w:type="dxa" w:w="1417"/>
           </w:tcPr>
           <w:p>
             <w:pPr>
@@ -3352,13 +3352,13 @@
                 <w:b w:val="0"/>
                 <w:sz w:val="15"/>
               </w:rPr>
-              <w:t>83-86</w:t>
-            </w:r>
-          </w:p>
-        </w:tc>
-        <w:tc>
-          <w:tcPr>
-            <w:tcW w:type="dxa" w:w="5783"/>
+              <w:t>84-87</w:t>
+            </w:r>
+          </w:p>
+        </w:tc>
+        <w:tc>
+          <w:tcPr>
+            <w:tcW w:type="dxa" w:w="5613"/>
           </w:tcPr>
           <w:p>
             <w:pPr>
@@ -3447,7 +3447,7 @@
         </w:tc>
         <w:tc>
           <w:tcPr>
-            <w:tcW w:type="dxa" w:w="1247"/>
+            <w:tcW w:type="dxa" w:w="1417"/>
           </w:tcPr>
           <w:p>
             <w:pPr>
@@ -3509,13 +3509,13 @@
                 <w:b w:val="0"/>
                 <w:sz w:val="15"/>
               </w:rPr>
-              <w:t>87-90</w:t>
-            </w:r>
-          </w:p>
-        </w:tc>
-        <w:tc>
-          <w:tcPr>
-            <w:tcW w:type="dxa" w:w="5783"/>
+              <w:t>88-91</w:t>
+            </w:r>
+          </w:p>
+        </w:tc>
+        <w:tc>
+          <w:tcPr>
+            <w:tcW w:type="dxa" w:w="5613"/>
           </w:tcPr>
           <w:p>
             <w:pPr>
@@ -3604,7 +3604,7 @@
         </w:tc>
         <w:tc>
           <w:tcPr>
-            <w:tcW w:type="dxa" w:w="1247"/>
+            <w:tcW w:type="dxa" w:w="1417"/>
           </w:tcPr>
           <w:p>
             <w:pPr>
@@ -3666,13 +3666,13 @@
                 <w:b w:val="0"/>
                 <w:sz w:val="15"/>
               </w:rPr>
-              <w:t>91-94</w:t>
-            </w:r>
-          </w:p>
-        </w:tc>
-        <w:tc>
-          <w:tcPr>
-            <w:tcW w:type="dxa" w:w="5783"/>
+              <w:t>92-95</w:t>
+            </w:r>
+          </w:p>
+        </w:tc>
+        <w:tc>
+          <w:tcPr>
+            <w:tcW w:type="dxa" w:w="5613"/>
           </w:tcPr>
           <w:p>
             <w:pPr>
@@ -3762,7 +3762,7 @@
         </w:tc>
         <w:tc>
           <w:tcPr>
-            <w:tcW w:type="dxa" w:w="1247"/>
+            <w:tcW w:type="dxa" w:w="1417"/>
           </w:tcPr>
           <w:p>
             <w:pPr>
@@ -3824,13 +3824,13 @@
                 <w:b w:val="0"/>
                 <w:sz w:val="15"/>
               </w:rPr>
-              <w:t>96-99</w:t>
-            </w:r>
-          </w:p>
-        </w:tc>
-        <w:tc>
-          <w:tcPr>
-            <w:tcW w:type="dxa" w:w="5783"/>
+              <w:t>97-100</w:t>
+            </w:r>
+          </w:p>
+        </w:tc>
+        <w:tc>
+          <w:tcPr>
+            <w:tcW w:type="dxa" w:w="5613"/>
           </w:tcPr>
           <w:p>
             <w:pPr>
@@ -3919,7 +3919,7 @@
         </w:tc>
         <w:tc>
           <w:tcPr>
-            <w:tcW w:type="dxa" w:w="1247"/>
+            <w:tcW w:type="dxa" w:w="1417"/>
           </w:tcPr>
           <w:p>
             <w:pPr>
@@ -3981,13 +3981,13 @@
                 <w:b w:val="0"/>
                 <w:sz w:val="15"/>
               </w:rPr>
-              <w:t>100-103</w:t>
-            </w:r>
-          </w:p>
-        </w:tc>
-        <w:tc>
-          <w:tcPr>
-            <w:tcW w:type="dxa" w:w="5783"/>
+              <w:t>101-104</w:t>
+            </w:r>
+          </w:p>
+        </w:tc>
+        <w:tc>
+          <w:tcPr>
+            <w:tcW w:type="dxa" w:w="5613"/>
           </w:tcPr>
           <w:p>
             <w:pPr>
@@ -4076,7 +4076,7 @@
         </w:tc>
         <w:tc>
           <w:tcPr>
-            <w:tcW w:type="dxa" w:w="1247"/>
+            <w:tcW w:type="dxa" w:w="1417"/>
           </w:tcPr>
           <w:p>
             <w:pPr>
@@ -4138,13 +4138,13 @@
                 <w:b w:val="0"/>
                 <w:sz w:val="15"/>
               </w:rPr>
-              <w:t>104-106</w:t>
-            </w:r>
-          </w:p>
-        </w:tc>
-        <w:tc>
-          <w:tcPr>
-            <w:tcW w:type="dxa" w:w="5783"/>
+              <w:t>105-107</w:t>
+            </w:r>
+          </w:p>
+        </w:tc>
+        <w:tc>
+          <w:tcPr>
+            <w:tcW w:type="dxa" w:w="5613"/>
           </w:tcPr>
           <w:p>
             <w:pPr>
@@ -4234,7 +4234,7 @@
         </w:tc>
         <w:tc>
           <w:tcPr>
-            <w:tcW w:type="dxa" w:w="1247"/>
+            <w:tcW w:type="dxa" w:w="1417"/>
           </w:tcPr>
           <w:p>
             <w:pPr>
@@ -4296,13 +4296,13 @@
                 <w:b w:val="0"/>
                 <w:sz w:val="15"/>
               </w:rPr>
-              <w:t>107-111</w:t>
-            </w:r>
-          </w:p>
-        </w:tc>
-        <w:tc>
-          <w:tcPr>
-            <w:tcW w:type="dxa" w:w="5783"/>
+              <w:t>108-112</w:t>
+            </w:r>
+          </w:p>
+        </w:tc>
+        <w:tc>
+          <w:tcPr>
+            <w:tcW w:type="dxa" w:w="5613"/>
           </w:tcPr>
           <w:p>
             <w:pPr>
@@ -4392,7 +4392,7 @@
         </w:tc>
         <w:tc>
           <w:tcPr>
-            <w:tcW w:type="dxa" w:w="1247"/>
+            <w:tcW w:type="dxa" w:w="1417"/>
           </w:tcPr>
           <w:p>
             <w:pPr>
@@ -4454,13 +4454,13 @@
                 <w:b w:val="0"/>
                 <w:sz w:val="15"/>
               </w:rPr>
-              <w:t>112-115</w:t>
-            </w:r>
-          </w:p>
-        </w:tc>
-        <w:tc>
-          <w:tcPr>
-            <w:tcW w:type="dxa" w:w="5783"/>
+              <w:t>113-116</w:t>
+            </w:r>
+          </w:p>
+        </w:tc>
+        <w:tc>
+          <w:tcPr>
+            <w:tcW w:type="dxa" w:w="5613"/>
           </w:tcPr>
           <w:p>
             <w:pPr>
@@ -4549,7 +4549,7 @@
         </w:tc>
         <w:tc>
           <w:tcPr>
-            <w:tcW w:type="dxa" w:w="1247"/>
+            <w:tcW w:type="dxa" w:w="1417"/>
           </w:tcPr>
           <w:p>
             <w:pPr>
@@ -4611,13 +4611,13 @@
                 <w:b w:val="0"/>
                 <w:sz w:val="15"/>
               </w:rPr>
-              <w:t>116-121</w:t>
-            </w:r>
-          </w:p>
-        </w:tc>
-        <w:tc>
-          <w:tcPr>
-            <w:tcW w:type="dxa" w:w="5783"/>
+              <w:t>117-122</w:t>
+            </w:r>
+          </w:p>
+        </w:tc>
+        <w:tc>
+          <w:tcPr>
+            <w:tcW w:type="dxa" w:w="5613"/>
           </w:tcPr>
           <w:p>
             <w:pPr>
@@ -4706,7 +4706,7 @@
         </w:tc>
         <w:tc>
           <w:tcPr>
-            <w:tcW w:type="dxa" w:w="1247"/>
+            <w:tcW w:type="dxa" w:w="1417"/>
           </w:tcPr>
           <w:p>
             <w:pPr>
@@ -4768,13 +4768,13 @@
                 <w:b w:val="0"/>
                 <w:sz w:val="15"/>
               </w:rPr>
-              <w:t>123-124</w:t>
-            </w:r>
-          </w:p>
-        </w:tc>
-        <w:tc>
-          <w:tcPr>
-            <w:tcW w:type="dxa" w:w="5783"/>
+              <w:t>124-125</w:t>
+            </w:r>
+          </w:p>
+        </w:tc>
+        <w:tc>
+          <w:tcPr>
+            <w:tcW w:type="dxa" w:w="5613"/>
           </w:tcPr>
           <w:p>
             <w:pPr>
@@ -4864,7 +4864,7 @@
         </w:tc>
         <w:tc>
           <w:tcPr>
-            <w:tcW w:type="dxa" w:w="1247"/>
+            <w:tcW w:type="dxa" w:w="1417"/>
           </w:tcPr>
           <w:p>
             <w:pPr>
@@ -4926,13 +4926,13 @@
                 <w:b w:val="0"/>
                 <w:sz w:val="15"/>
               </w:rPr>
-              <w:t>128-131</w:t>
-            </w:r>
-          </w:p>
-        </w:tc>
-        <w:tc>
-          <w:tcPr>
-            <w:tcW w:type="dxa" w:w="5783"/>
+              <w:t>129-132</w:t>
+            </w:r>
+          </w:p>
+        </w:tc>
+        <w:tc>
+          <w:tcPr>
+            <w:tcW w:type="dxa" w:w="5613"/>
           </w:tcPr>
           <w:p>
             <w:pPr>
@@ -5022,7 +5022,7 @@
         </w:tc>
         <w:tc>
           <w:tcPr>
-            <w:tcW w:type="dxa" w:w="1247"/>
+            <w:tcW w:type="dxa" w:w="1417"/>
           </w:tcPr>
           <w:p>
             <w:pPr>
@@ -5084,13 +5084,13 @@
                 <w:b w:val="0"/>
                 <w:sz w:val="15"/>
               </w:rPr>
-              <w:t>132-136</w:t>
-            </w:r>
-          </w:p>
-        </w:tc>
-        <w:tc>
-          <w:tcPr>
-            <w:tcW w:type="dxa" w:w="5783"/>
+              <w:t>133-137</w:t>
+            </w:r>
+          </w:p>
+        </w:tc>
+        <w:tc>
+          <w:tcPr>
+            <w:tcW w:type="dxa" w:w="5613"/>
           </w:tcPr>
           <w:p>
             <w:pPr>
@@ -5180,7 +5180,7 @@
         </w:tc>
         <w:tc>
           <w:tcPr>
-            <w:tcW w:type="dxa" w:w="1247"/>
+            <w:tcW w:type="dxa" w:w="1417"/>
           </w:tcPr>
           <w:p>
             <w:pPr>
@@ -5242,13 +5242,13 @@
                 <w:b w:val="0"/>
                 <w:sz w:val="15"/>
               </w:rPr>
-              <w:t>137-141</w:t>
-            </w:r>
-          </w:p>
-        </w:tc>
-        <w:tc>
-          <w:tcPr>
-            <w:tcW w:type="dxa" w:w="5783"/>
+              <w:t>138-142</w:t>
+            </w:r>
+          </w:p>
+        </w:tc>
+        <w:tc>
+          <w:tcPr>
+            <w:tcW w:type="dxa" w:w="5613"/>
           </w:tcPr>
           <w:p>
             <w:pPr>
@@ -5337,7 +5337,7 @@
         </w:tc>
         <w:tc>
           <w:tcPr>
-            <w:tcW w:type="dxa" w:w="1247"/>
+            <w:tcW w:type="dxa" w:w="1417"/>
           </w:tcPr>
           <w:p>
             <w:pPr>
@@ -5399,13 +5399,13 @@
                 <w:b w:val="0"/>
                 <w:sz w:val="15"/>
               </w:rPr>
-              <w:t>142-145</w:t>
-            </w:r>
-          </w:p>
-        </w:tc>
-        <w:tc>
-          <w:tcPr>
-            <w:tcW w:type="dxa" w:w="5783"/>
+              <w:t>143-146</w:t>
+            </w:r>
+          </w:p>
+        </w:tc>
+        <w:tc>
+          <w:tcPr>
+            <w:tcW w:type="dxa" w:w="5613"/>
           </w:tcPr>
           <w:p>
             <w:pPr>
@@ -5494,7 +5494,7 @@
         </w:tc>
         <w:tc>
           <w:tcPr>
-            <w:tcW w:type="dxa" w:w="1247"/>
+            <w:tcW w:type="dxa" w:w="1417"/>
           </w:tcPr>
           <w:p>
             <w:pPr>
@@ -5556,13 +5556,13 @@
                 <w:b w:val="0"/>
                 <w:sz w:val="15"/>
               </w:rPr>
-              <w:t>146-148</w:t>
-            </w:r>
-          </w:p>
-        </w:tc>
-        <w:tc>
-          <w:tcPr>
-            <w:tcW w:type="dxa" w:w="5783"/>
+              <w:t>147-149</w:t>
+            </w:r>
+          </w:p>
+        </w:tc>
+        <w:tc>
+          <w:tcPr>
+            <w:tcW w:type="dxa" w:w="5613"/>
           </w:tcPr>
           <w:p>
             <w:pPr>
@@ -5652,7 +5652,7 @@
         </w:tc>
         <w:tc>
           <w:tcPr>
-            <w:tcW w:type="dxa" w:w="1247"/>
+            <w:tcW w:type="dxa" w:w="1417"/>
           </w:tcPr>
           <w:p>
             <w:pPr>
@@ -5714,13 +5714,13 @@
                 <w:b w:val="0"/>
                 <w:sz w:val="15"/>
               </w:rPr>
-              <w:t>150-152</w:t>
-            </w:r>
-          </w:p>
-        </w:tc>
-        <w:tc>
-          <w:tcPr>
-            <w:tcW w:type="dxa" w:w="5783"/>
+              <w:t>151-153</w:t>
+            </w:r>
+          </w:p>
+        </w:tc>
+        <w:tc>
+          <w:tcPr>
+            <w:tcW w:type="dxa" w:w="5613"/>
           </w:tcPr>
           <w:p>
             <w:pPr>
@@ -5810,7 +5810,7 @@
         </w:tc>
         <w:tc>
           <w:tcPr>
-            <w:tcW w:type="dxa" w:w="1247"/>
+            <w:tcW w:type="dxa" w:w="1417"/>
           </w:tcPr>
           <w:p>
             <w:pPr>
@@ -5872,13 +5872,13 @@
                 <w:b w:val="0"/>
                 <w:sz w:val="15"/>
               </w:rPr>
-              <w:t>153-155</w:t>
-            </w:r>
-          </w:p>
-        </w:tc>
-        <w:tc>
-          <w:tcPr>
-            <w:tcW w:type="dxa" w:w="5783"/>
+              <w:t>154-156</w:t>
+            </w:r>
+          </w:p>
+        </w:tc>
+        <w:tc>
+          <w:tcPr>
+            <w:tcW w:type="dxa" w:w="5613"/>
           </w:tcPr>
           <w:p>
             <w:pPr>

</xml_diff>